<commit_message>
docs: align thesis with wave and wind scope
</commit_message>
<xml_diff>
--- a/THESIS DOCUMENTATION/BayStation.docx
+++ b/THESIS DOCUMENTATION/BayStation.docx
@@ -156,7 +156,7 @@
         <ns0:rPr/>
       </ns0:pPr>
       <ns0:r>
-        <ns0:t>Project FALCON-01 is a low-cost, modular, solar-powered smart coastal observation buoy designed for near-real-time coastal monitoring. The revised architecture separates the low-power buoy sensing node from a shore-based Bay Station. The buoy contains only the ESP32 controller, approved sensors, LTE/cellular telemetry hardware, battery/solar power subsystem, and security electronics. It does not contain a mini PC. Validated telemetry is transmitted through an available cellular data network to a shore-based Bay Station, where a mini PC performs database storage, pressure-based wave processing, REST API services, dashboard hosting, alert management, and AI-based short-term wave-height prediction.</ns0:t>
+        <ns0:t>Project FALCON-01 is a low-cost, modular, solar-powered smart coastal observation buoy designed for near-real-time coastal monitoring. The revised architecture separates the low-power buoy sensing node from a shore-based Bay Station. The buoy contains only the ESP32 controller, pressure and wind sensors, supporting GPS/power/security telemetry, LTE/cellular hardware, and the battery/solar subsystem. It does not contain a mini PC. Validated telemetry is transmitted through an available cellular data network to a shore-based Bay Station, where a mini PC performs database storage, pressure-based wave processing, REST API services, dashboard hosting, alert management, and AI-based short-term wave-height prediction.</ns0:t>
       </ns0:r>
     </ns0:p>
     <ns0:p>
@@ -253,7 +253,7 @@
       </ns0:pPr>
       <ns0:r>
         <ns0:rPr/>
-        <ns0:t>Many low-cost monitoring prototypes demonstrate sensors and dashboards but do not provide a complete serviceable platform that combines traceable pressure-based wave estimation, local environmental data, power autonomy, local data retention, and basic anti-theft/tamper awareness. The study asks whether these functions can be integrated and evaluated within an affordable undergraduate prototype while clearly distinguishing measured, estimated, simulated, stale, and uncalibrated data.</ns0:t>
+        <ns0:t>Many low-cost monitoring prototypes demonstrate sensors and dashboards but do not provide a complete serviceable platform that combines traceable pressure-based wave estimation, wind monitoring, power autonomy, local data retention, and basic anti-theft/tamper awareness. The study asks whether these functions can be integrated and evaluated within an affordable undergraduate prototype while clearly distinguishing measured, estimated, simulated, stale, and uncalibrated data.</ns0:t>
       </ns0:r>
     </ns0:p>
     <ns0:p>
@@ -414,7 +414,7 @@
       </ns0:pPr>
       <ns0:r>
         <ns0:rPr/>
-        <ns0:t>1. Integrate pressure, GPS, wind, environmental, power, system-health, and security channels using documented interfaces and calibration states.</ns0:t>
+        <ns0:t>1. Integrate pressure and wind channels using documented interfaces and calibration states, with GPS, power, timestamp, and security values retained as supporting telemetry.</ns0:t>
       </ns0:r>
     </ns0:p>
     <ns0:p>
@@ -495,7 +495,7 @@
         <ns0:rPr/>
       </ns0:pPr>
       <ns0:r>
-        <ns0:t>Phase 1 covers a single near-shore prototype, passive single-anchor mooring, ESP32-based onboard acquisition, LTE/cellular data telemetry, pressure-based estimated wave height, core/supporting environmental readings, onboard power monitoring, basic security, short-term outage buffering, and a shore-based Bay Station mini PC that hosts processing, storage, API services, the browser dashboard, alerts, and AI short-term wave-height prediction. The buoy itself contains no mini PC. The exact final mini PC and cellular modem are subject to component approval.</ns0:t>
+        <ns0:t>Phase 1 covers a single near-shore prototype, passive single-anchor mooring, ESP32-based acquisition, LTE/cellular data telemetry, pressure-based estimated wave height, wind speed/direction, supporting telemetry, basic security, short-term outage buffering, and a shore-based Bay Station mini PC that hosts processing, storage, API services, the browser dashboard, alerts, and AI short-term wave-height prediction. The buoy itself contains no mini PC. The exact final mini PC and cellular modem are subject to component approval.</ns0:t>
       </ns0:r>
     </ns0:p>
     <ns0:p>
@@ -1197,7 +1197,7 @@
             </ns0:pPr>
             <ns0:r>
               <ns0:rPr/>
-              <ns0:t>Sealed DS18B20</ns0:t>
+              <ns0:t>Supporting GPS/power/security telemetry</ns0:t>
             </ns0:r>
           </ns0:p>
         </ns0:tc>
@@ -1217,7 +1217,7 @@
             </ns0:pPr>
             <ns0:r>
               <ns0:rPr/>
-              <ns0:t>Water temperature; reference comparison required</ns0:t>
+              <ns0:t>Position, operational state, and power context; not a primary measurement</ns0:t>
             </ns0:r>
           </ns0:p>
         </ns0:tc>
@@ -1468,17 +1468,17 @@
       </ns0:pPr>
       <ns0:r>
         <ns0:rPr/>
-        <ns0:t>7.1 Water Temperature Monitoring</ns0:t>
-      </ns0:r>
-    </ns0:p>
-    <ns0:p>
-      <ns0:pPr>
-        <ns0:pStyle ns0:val="Normal"/>
-        <ns0:rPr/>
-      </ns0:pPr>
-      <ns0:r>
-        <ns0:rPr/>
-        <ns0:t>FALCON includes a sealed DS18B20 supporting sensor that reports water temperature in degrees Celsius. This channel provides environmental context and does not constitute laboratory-grade water-quality analysis.</ns0:t>
+        <ns0:t>7.1 Primary Wave and Wind Measurement</ns0:t>
+      </ns0:r>
+    </ns0:p>
+    <ns0:p>
+      <ns0:pPr>
+        <ns0:pStyle ns0:val="Normal"/>
+        <ns0:rPr/>
+      </ns0:pPr>
+      <ns0:r>
+        <ns0:rPr/>
+        <ns0:t>FALCON's required measurement scope is limited to pressure-derived wave estimation and wind speed/direction. Water temperature and other environmental channels are excluded from Phase 1.</ns0:t>
       </ns0:r>
     </ns0:p>
     <ns0:tbl>
@@ -1585,7 +1585,7 @@
             </ns0:pPr>
             <ns0:r>
               <ns0:rPr/>
-              <ns0:t>Sealed DS18B20</ns0:t>
+              <ns0:t>Supporting GPS/power/security telemetry</ns0:t>
             </ns0:r>
           </ns0:p>
         </ns0:tc>
@@ -1606,7 +1606,7 @@
             </ns0:pPr>
             <ns0:r>
               <ns0:rPr/>
-              <ns0:t>Water temperature (°C), timestamp, validity, and freshness</ns0:t>
+              <ns0:t>Wind speed/direction timestamp, validity, and freshness</ns0:t>
             </ns0:r>
           </ns0:p>
         </ns0:tc>
@@ -1640,7 +1640,7 @@
       </ns0:pPr>
       <ns0:r>
         <ns0:rPr/>
-        <ns0:t>The dashboard displays this channel under Water. Exact model identification, sampling, freshness, validity, and reference-comparison status remain available in expanded technical details.</ns0:t>
+        <ns0:t>The dashboard displays wave/pressure and wind channels as the primary measurements. Supporting telemetry remains available in expanded technical details.</ns0:t>
       </ns0:r>
     </ns0:p>
     <ns0:p>
@@ -2589,7 +2589,7 @@
         <ns0:rPr/>
       </ns0:pPr>
       <ns0:r>
-        <ns0:t>1. Overview: one large estimated-wave chart with a clearly labeled AI comparison line, a separate short-term prediction card, and one Station Status summary for wind, pressure, GPS security, battery, solar, and water/enclosure temperature.</ns0:t>
+        <ns0:t>1. Overview: one large estimated-wave chart with a clearly labeled AI comparison line, a separate short-term prediction card, and one Station Status summary for wind, pressure, supporting GPS/security, and power telemetry.</ns0:t>
       </ns0:r>
     </ns0:p>
     <ns0:p>
@@ -2612,7 +2612,7 @@
       </ns0:pPr>
       <ns0:r>
         <ns0:rPr/>
-        <ns0:t>3. Sensors: six grouped user-facing cards—Wave &amp; Pressure, GPS &amp; Security, Wind, Water, Power, and System. Technical details such as exact sensor model, sampling rate, calibration state, signal quality, and update age remain available through expandable details.</ns0:t>
+        <ns0:t>3. Sensors: three grouped user-facing cards—Wave &amp; Pressure, Wind, and Supporting Telemetry. Technical details such as exact sensor model, sampling rate, calibration state, signal quality, and update age remain available through expandable details.</ns0:t>
       </ns0:r>
     </ns0:p>
     <ns0:p>
@@ -3133,7 +3133,7 @@
         <ns0:rPr/>
       </ns0:pPr>
       <ns0:r>
-        <ns0:t>The expected output is a documented, serviceable research prototype consisting of a low-power solar buoy sensing node and a shore-based Bay Station. The buoy provides traceable coastal readings, pressure-based estimated wave height inputs, GPS/security awareness, and cellular telemetry; the Bay Station provides persistent records, processing, alerts, and a usable dashboard. Potential Bay Station hosts include educational institutions, LGUs/DRRM offices, DOST facilities, and partner research organizations. Operational adoption requires further validation and coordination with competent authorities.</ns0:t>
+        <ns0:t>The expected output is a documented, serviceable research prototype consisting of a low-power solar buoy sensing node and a shore-based Bay Station. The buoy provides pressure-derived wave estimates, wind observations, supporting GPS/security telemetry, and cellular telemetry; the Bay Station provides persistent records, processing, alerts, and a usable dashboard. Potential Bay Station hosts include educational institutions, LGUs/DRRM offices, DOST facilities, and partner research organizations. Operational adoption requires further validation and coordination with competent authorities.</ns0:t>
       </ns0:r>
     </ns0:p>
     <ns0:p>
@@ -3179,7 +3179,7 @@
         <ns0:rPr/>
       </ns0:pPr>
       <ns0:r>
-        <ns0:t>3. Bench-integrate Bar02, GPS, wind, DS18B20, power/security channels, ESP32, and the selected cellular modem.</ns0:t>
+        <ns0:t>3. Bench-integrate Bar02 and wind channels, then verify the supporting GPS, power, security, ESP32, and cellular telemetry interfaces.</ns0:t>
       </ns0:r>
     </ns0:p>
     <ns0:p>
@@ -3191,7 +3191,7 @@
       </ns0:pPr>
       <ns0:r>
         <ns0:rPr/>
-        <ns0:t>4. Complete pressure/environment/security calibration and controlled reference tests.</ns0:t>
+        <ns0:t>4. Complete pressure/wind calibration and controlled reference tests, with supporting security checks.</ns0:t>
       </ns0:r>
     </ns0:p>
     <ns0:p>
@@ -3337,7 +3337,7 @@
       </ns0:pPr>
       <ns0:r>
         <ns0:rPr/>
-        <ns0:t>The Sensors page does not display one card per physical device. Individual devices are grouped into six user-facing categories: (1) Wave &amp; Pressure, (2) GPS &amp; Security, (3) Wind, (4) Water, (5) Power, and (6) System. Expanded details preserve the underlying engineering information such as exact sensor model, sample rate, signal quality, calibration state, source, and update age.</ns0:t>
+        <ns0:t>The Sensors page does not display one card per physical device. Individual devices are grouped into three user-facing categories: (1) Wave &amp; Pressure, (2) Wind, and (3) Supporting Telemetry. Expanded details preserve the underlying engineering information such as exact sensor model, sample rate, signal quality, calibration state, source, and update age.</ns0:t>
       </ns0:r>
     </ns0:p>
     <ns0:p>
@@ -3727,7 +3727,7 @@
           </ns0:tcPr>
           <ns0:p>
             <ns0:r>
-              <ns0:t>Pressure, GPS, wind, water, power, and security sensors</ns0:t>
+              <ns0:t>Pressure and wind sensors, with supporting GPS, power, and security telemetry</ns0:t>
             </ns0:r>
           </ns0:p>
         </ns0:tc>
@@ -5203,7 +5203,7 @@
             </ns0:pPr>
             <ns0:r>
               <ns0:rPr/>
-              <ns0:t>Acquire sealed-probe water temperature with explicit validity and freshness states.</ns0:t>
+              <ns0:t>Acquire pressure and wind measurements with explicit validity, calibration, and freshness states.</ns0:t>
             </ns0:r>
           </ns0:p>
         </ns0:tc>
@@ -5224,7 +5224,7 @@
             </ns0:pPr>
             <ns0:r>
               <ns0:rPr/>
-              <ns0:t>DS18B20 reference comparison, stale/disconnect tests, and correct dashboard labels.</ns0:t>
+              <ns0:t>Pressure-reference and wind-instrument comparison, stale/disconnect tests, and correct dashboard labels.</ns0:t>
             </ns0:r>
           </ns0:p>
         </ns0:tc>

</xml_diff>

<commit_message>
docs: define LTE primary and LoRa fallback
</commit_message>
<xml_diff>
--- a/THESIS DOCUMENTATION/BayStation.docx
+++ b/THESIS DOCUMENTATION/BayStation.docx
@@ -495,7 +495,7 @@
         <ns0:rPr/>
       </ns0:pPr>
       <ns0:r>
-        <ns0:t>Phase 1 covers a single near-shore prototype, passive single-anchor mooring, ESP32-based acquisition, LTE/cellular data telemetry, pressure-based estimated wave height, wind speed/direction, supporting telemetry, basic security, short-term outage buffering, and a shore-based Bay Station mini PC that hosts processing, storage, API services, the browser dashboard, alerts, and AI short-term wave-height prediction. The buoy itself contains no mini PC. The exact final mini PC and cellular modem are subject to component approval.</ns0:t>
+        <ns0:t>Phase 1 covers a single near-shore prototype, passive single-anchor mooring, ESP32-based acquisition, LTE/cellular primary data telemetry with optional LoRa fallback, pressure-based estimated wave height, wind speed/direction, supporting telemetry, basic security, short-term outage buffering, and a shore-based Bay Station mini PC that hosts processing, storage, API services, the browser dashboard, alerts, and AI short-term wave-height prediction. The buoy itself contains no mini PC. The exact final mini PC, LTE modem and optional LoRa fallback and optional LoRa fallback and optional LoRa fallback, optional LoRa radio/gateway, and communication interfaces are subject to component approval.</ns0:t>
       </ns0:r>
     </ns0:p>
     <ns0:p>
@@ -507,7 +507,7 @@
         <ns0:rPr/>
       </ns0:pPr>
       <ns0:r>
-        <ns0:t>The study does not provide official weather, storm, typhoon, tsunami, navigation, or emergency warnings. It does not claim laboratory-grade water-quality analysis, professional oceanographic accuracy, autonomous navigation, guaranteed uninterrupted Internet service, satellite communication through an unsupported modem, camera AI, or multi-buoy operation. Cellular provider selection depends on deployment-site coverage. Satellite-to-mobile connectivity may be considered only as a fallback where service and device/modem compatibility are verified. AI is limited to short-term wave-height prediction and shall not be presented as storm, typhoon, tsunami, or emergency prediction.</ns0:t>
+        <ns0:t>The study does not provide official weather, storm, typhoon, tsunami, navigation, or emergency warnings. It does not claim laboratory-grade water-quality analysis, professional oceanographic accuracy, autonomous navigation, guaranteed uninterrupted Internet service, satellite communication through an unsupported modem, camera AI, or multi-buoy operation. Cellular provider selection and optional LoRa gateway placement depend on deployment-site coverage, radio range, and line-of-sight testing. Satellite-to-mobile connectivity may be considered only as a fallback where service and device/modem compatibility are verified. AI is limited to short-term wave-height prediction and shall not be presented as storm, typhoon, tsunami, or emergency prediction.</ns0:t>
       </ns0:r>
     </ns0:p>
     <ns0:p>
@@ -2359,7 +2359,7 @@
         <ns0:rPr/>
       </ns0:pPr>
       <ns0:r>
-        <ns0:t>The ESP32 publishes versioned telemetry to the selected LTE/cellular modem/interface for transmission over an available mobile data network to the shore-based Bay Station. The exact modem protocol and network provider remain subject to component and site-coverage selection. The Bay Station mini PC receives and validates telemetry, stores original payloads and derived records in SQLite, calculates pressure-based wave estimates and current system state, persists alerts/events, serves the dashboard through a REST API, and runs the short-term wave-height prediction model. If the cellular link is unavailable, the buoy continues sensing and security functions and retains a short-term telemetry buffer for retransmission after reconnection. Satellite-to-mobile service is a fallback concept only where the selected modem/device and service are confirmed compatible.</ns0:t>
+        <ns0:t>The ESP32 publishes versioned telemetry to the selected LTE/cellular modem/interface for transmission over an available mobile data network to the shore-based Bay Station. The exact LTE modem and optional LoRa fallback and optional LoRa fallback and optional LoRa fallback, optional LoRa module/gateway, protocols, and network providers remain subject to component and site-coverage selection. The Bay Station mini PC receives and validates telemetry, stores original payloads and derived records in SQLite, calculates pressure-based wave estimates and current system state, persists alerts/events, serves the dashboard through a REST API, and runs the short-term wave-height prediction model. The ESP32 attempts LTE first, then a verified shore LoRa gateway; if both links are unavailable, it continues sensing/security and buffers telemetry for retransmission after reconnection. Satellite-to-mobile service is a fallback concept only where the selected modem/device and service are confirmed compatible.</ns0:t>
       </ns0:r>
     </ns0:p>
     <ns0:p>

</xml_diff>

<commit_message>
Adopt LoRa primary buoy communications
Update Project FALCON architecture, thesis documentation, hardware/BOM, selection gates, firmware specification, and validation plan for LoRa telemetry from the buoy to the barangay-hall Bay Station. Define SIM/4G/5G as Bay Station Internet backhaul for cloud upload and authorized remote access.
</commit_message>
<xml_diff>
--- a/THESIS DOCUMENTATION/BayStation.docx
+++ b/THESIS DOCUMENTATION/BayStation.docx
@@ -217,7 +217,7 @@
         <ns0:rPr/>
       </ns0:pPr>
       <ns0:r>
-        <ns0:t>Affordable microcontrollers, LTE/cellular telemetry modules, shore-based mini PCs, solar components, and open-source software make it possible to investigate a practical split architecture. FALCON uses an ESP32 as a low-power onboard acquisition controller while a shore-based Bay Station mini PC provides storage, processing, visualization, alerting, and AI-based short-term wave-height prediction. This arrangement reduces the energy burden on the buoy and allows compute performance, storage, and AI capability to be upgraded without redesigning the marine sensing node. Its purpose is educational and research-oriented monitoring, not replacement of professional oceanographic instruments or official agencies.</ns0:t>
+        <ns0:t>Affordable microcontrollers, LTE/LoRa telemetry with Bay Station Internet backhaul modules, shore-based mini PCs, solar components, and open-source software make it possible to investigate a practical split architecture. FALCON uses an ESP32 as a low-power onboard acquisition controller while a shore-based Bay Station mini PC provides storage, processing, visualization, alerting, and AI-based short-term wave-height prediction. This arrangement reduces the energy burden on the buoy and allows compute performance, storage, and AI capability to be upgraded without redesigning the marine sensing node. Its purpose is educational and research-oriented monitoring, not replacement of professional oceanographic instruments or official agencies.</ns0:t>
       </ns0:r>
     </ns0:p>
     <ns0:p>
@@ -345,7 +345,7 @@
         <ns0:rPr/>
       </ns0:pPr>
       <ns0:r>
-        <ns0:t>Existing low-cost IoT studies frequently emphasize acquisition and display, while professional platforms emphasize calibrated accuracy at substantially greater cost. A practical gap remains for an open, modular educational architecture that combines a low-power marine sensing node, pressure-based wave estimation, solar autonomy, LTE/cellular telemetry, shore-based processing, local institutional data retention, serviceability, basic security monitoring, and evaluated short-term AI wave-height prediction for controlled Philippine coastal trials.</ns0:t>
+        <ns0:t>Existing low-cost IoT studies frequently emphasize acquisition and display, while professional platforms emphasize calibrated accuracy at substantially greater cost. A practical gap remains for an open, modular educational architecture that combines a low-power marine sensing node, pressure-based wave estimation, solar autonomy, LTE/LoRa telemetry with Bay Station Internet backhaul, shore-based processing, local institutional data retention, serviceability, basic security monitoring, and evaluated short-term AI wave-height prediction for controlled Philippine coastal trials.</ns0:t>
       </ns0:r>
     </ns0:p>
     <ns0:p>
@@ -357,7 +357,7 @@
         <ns0:rPr/>
       </ns0:pPr>
       <ns0:r>
-        <ns0:t>FALCON does not claim to invent pressure sensing, GPS geofencing, cellular telemetry, or wave science. Its proposed novelty is the transparent integration and evaluation of these established technologies in a split buoy-to-Bay-Station architecture. The buoy focuses on sensing, local security, temporary buffering, and reliable telemetry, while the Bay Station mini PC performs storage, calibrated wave processing, visualization, alerting, and short-term AI wave-height prediction. The study will report calibration state, prediction error, network availability, limitations, and actual test evidence rather than presenting planned hardware or simulator output as completed field performance.</ns0:t>
+        <ns0:t>FALCON does not claim to invent pressure sensing, GPS geofencing, LoRa telemetry with Bay Station Internet backhaul, or wave science. Its proposed novelty is the transparent integration and evaluation of these established technologies in a split buoy-to-Bay-Station architecture. The buoy focuses on sensing, local security, temporary buffering, and reliable telemetry, while the Bay Station mini PC performs storage, calibrated wave processing, visualization, alerting, and short-term AI wave-height prediction. The study will report calibration state, prediction error, network availability, limitations, and actual test evidence rather than presenting planned hardware or simulator output as completed field performance.</ns0:t>
       </ns0:r>
     </ns0:p>
     <ns0:p>
@@ -391,7 +391,7 @@
         <ns0:rPr/>
       </ns0:pPr>
       <ns0:r>
-        <ns0:t>To design, develop, and evaluate a low-cost solar-powered smart coastal observation buoy that provides real-time coastal monitoring, pressure-based estimated wave height, and shore-based AI short-term wave-height prediction through an ESP32 sensing node, LTE/cellular telemetry link, Bay Station mini PC, and responsive web dashboard.</ns0:t>
+        <ns0:t>To design, develop, and evaluate a low-cost solar-powered smart coastal observation buoy that provides real-time coastal monitoring, pressure-based estimated wave height, and shore-based AI short-term wave-height prediction through an ESP32 sensing node, LTE/LoRa telemetry with Bay Station Internet backhaul link, Bay Station mini PC, and responsive web dashboard.</ns0:t>
       </ns0:r>
     </ns0:p>
     <ns0:p>
@@ -449,7 +449,7 @@
         <ns0:rPr/>
       </ns0:pPr>
       <ns0:r>
-        <ns0:t>4. Implement LTE/cellular telemetry from the buoy to a shore-based Bay Station mini PC, with validated ingestion, SQLite storage, REST API, logs, alerts, temporary outage buffering, and automatic recovery when connectivity returns.</ns0:t>
+        <ns0:t>4. Implement LTE/LoRa telemetry with Bay Station Internet backhaul from the buoy to a shore-based Bay Station mini PC, with validated ingestion, SQLite storage, REST API, logs, alerts, temporary outage buffering, and automatic recovery when connectivity returns.</ns0:t>
       </ns0:r>
     </ns0:p>
     <ns0:p>
@@ -495,7 +495,7 @@
         <ns0:rPr/>
       </ns0:pPr>
       <ns0:r>
-        <ns0:t>Phase 1 covers a single near-shore prototype, passive single-anchor mooring, ESP32-based acquisition, LTE/cellular primary data telemetry with optional LoRa fallback, pressure-based estimated wave height, wind speed/direction, supporting telemetry, basic security, short-term outage buffering, and a shore-based Bay Station mini PC that hosts processing, storage, API services, the browser dashboard, alerts, and AI short-term wave-height prediction. The buoy itself contains no mini PC. The exact final mini PC, LTE modem and optional LoRa fallback and optional LoRa fallback and optional LoRa fallback, optional LoRa radio/gateway, and communication interfaces are subject to component approval.</ns0:t>
+        <ns0:t>Phase 1 covers a single near-shore prototype, passive single-anchor mooring, ESP32-based acquisition, LoRa primary buoy telemetry to the barangay-hall Bay Station with SIM/4G/5G Internet backhaul, pressure-based estimated wave height, wind speed/direction, supporting telemetry, basic security, short-term outage buffering, and a shore-based Bay Station mini PC that hosts processing, storage, API services, the browser dashboard, alerts, and AI short-term wave-height prediction. The buoy itself contains no mini PC. The exact final mini PC, LTE modem, optional LoRa radio/gateway, and communication interfaces are subject to component approval.</ns0:t>
       </ns0:r>
     </ns0:p>
     <ns0:p>
@@ -611,7 +611,7 @@
         <ns0:rPr/>
       </ns0:pPr>
       <ns0:r>
-        <ns0:t>Figure 1. Revised Project FALCON-01 buoy-to-Bay-Station system architecture and cellular telemetry flow.</ns0:t>
+        <ns0:t>Figure 1. Revised Project FALCON-01 buoy-to-Bay-Station system architecture and LoRa telemetry with Bay Station Internet backhaul flow.</ns0:t>
       </ns0:r>
     </ns0:p>
     <ns0:tbl>
@@ -2359,7 +2359,7 @@
         <ns0:rPr/>
       </ns0:pPr>
       <ns0:r>
-        <ns0:t>The ESP32 publishes versioned telemetry to the selected LTE/cellular modem/interface for transmission over an available mobile data network to the shore-based Bay Station. The exact LTE modem and optional LoRa fallback and optional LoRa fallback and optional LoRa fallback, optional LoRa module/gateway, protocols, and network providers remain subject to component and site-coverage selection. The Bay Station mini PC receives and validates telemetry, stores original payloads and derived records in SQLite, calculates pressure-based wave estimates and current system state, persists alerts/events, serves the dashboard through a REST API, and runs the short-term wave-height prediction model. The ESP32 attempts LTE first, then a verified shore LoRa gateway; if both links are unavailable, it continues sensing/security and buffers telemetry for retransmission after reconnection. Satellite-to-mobile service is a fallback concept only where the selected modem/device and service are confirmed compatible.</ns0:t>
+        <ns0:t>The ESP32 publishes versioned telemetry to the selected LTE/cellular modem/interface for transmission over an available mobile data network to the shore-based Bay Station. The exact LoRa module/gateway, SIM/4G/5G Bay Station modem/provider, cloud endpoint, protocols, and site-coverage selection remain subject to approval. The Bay Station mini PC receives and validates telemetry, stores original payloads and derived records in SQLite, calculates pressure-based wave estimates and current system state, persists alerts/events, serves the dashboard through a REST API, and runs the short-term wave-height prediction model. The ESP32 transmits over LoRa to the verified barangay-hall gateway; if the LoRa path is unavailable, it continues sensing/security and buffers telemetry for retransmission after reconnection. Satellite-to-mobile service is a fallback concept only where the selected modem/device and service are confirmed compatible.</ns0:t>
       </ns0:r>
     </ns0:p>
     <ns0:p>
@@ -3133,7 +3133,7 @@
         <ns0:rPr/>
       </ns0:pPr>
       <ns0:r>
-        <ns0:t>The expected output is a documented, serviceable research prototype consisting of a low-power solar buoy sensing node and a shore-based Bay Station. The buoy provides pressure-derived wave estimates, wind observations, supporting GPS/security telemetry, and cellular telemetry; the Bay Station provides persistent records, processing, alerts, and a usable dashboard. Potential Bay Station hosts include educational institutions, LGUs/DRRM offices, DOST facilities, and partner research organizations. Operational adoption requires further validation and coordination with competent authorities.</ns0:t>
+        <ns0:t>The expected output is a documented, serviceable research prototype consisting of a low-power solar buoy sensing node and a shore-based Bay Station. The buoy provides pressure-derived wave estimates, wind observations, supporting GPS/security telemetry, and LoRa telemetry with Bay Station Internet backhaul; the Bay Station provides persistent records, processing, alerts, and a usable dashboard. Potential Bay Station hosts include educational institutions, LGUs/DRRM offices, DOST facilities, and partner research organizations. Operational adoption requires further validation and coordination with competent authorities.</ns0:t>
       </ns0:r>
     </ns0:p>
     <ns0:p>
@@ -3179,7 +3179,7 @@
         <ns0:rPr/>
       </ns0:pPr>
       <ns0:r>
-        <ns0:t>3. Bench-integrate Bar02 and wind channels, then verify the supporting GPS, power, security, ESP32, and cellular telemetry interfaces.</ns0:t>
+        <ns0:t>3. Bench-integrate Bar02 and wind channels, then verify the supporting GPS, power, security, ESP32, and LoRa telemetry with Bay Station Internet backhaul interfaces.</ns0:t>
       </ns0:r>
     </ns0:p>
     <ns0:p>
@@ -4022,7 +4022,7 @@
         <ns0:rPr/>
       </ns0:pPr>
       <ns0:r>
-        <ns0:t>Preliminary daily harvest uses panel rating × 4 peak-sun-hours × 70% net system efficiency. The 70% factor provisionally covers MPPT, wiring, conversion, temperature, orientation, and contamination losses; actual deployment conditions must be logged. Since the compute-intensive mini PC is shore based, the buoy solar system is sized only for sensing, LTE/cellular telemetry, security, and power conversion. No panel reduction shall be finalized until transmission peaks and 24-hour energy use are measured.</ns0:t>
+        <ns0:t>Preliminary daily harvest uses panel rating × 4 peak-sun-hours × 70% net system efficiency. The 70% factor provisionally covers MPPT, wiring, conversion, temperature, orientation, and contamination losses; actual deployment conditions must be logged. Since the compute-intensive mini PC is shore based, the buoy solar system is sized only for sensing, LTE/LoRa telemetry with Bay Station Internet backhaul, security, and power conversion. No panel reduction shall be finalized until transmission peaks and 24-hour energy use are measured.</ns0:t>
       </ns0:r>
     </ns0:p>
     <ns0:tbl>
@@ -4177,7 +4177,7 @@
           </ns0:tcPr>
           <ns0:p>
             <ns0:r>
-              <ns0:t>Stronger prototype starting point pending measured cellular telemetry load and site conditions</ns0:t>
+              <ns0:t>Stronger prototype starting point pending measured LoRa telemetry with Bay Station Internet backhaul load and site conditions</ns0:t>
             </ns0:r>
           </ns0:p>
         </ns0:tc>

</xml_diff>

<commit_message>
Update pressure sensor documentation baseline
</commit_message>
<xml_diff>
--- a/THESIS DOCUMENTATION/BayStation.docx
+++ b/THESIS DOCUMENTATION/BayStation.docx
@@ -2,6 +2,51 @@
 <file path=word/document.xml><?xml version="1.0" encoding="utf-8"?>
 <w:document xmlns:wpc="http://schemas.microsoft.com/office/word/2010/wordprocessingCanvas" xmlns:mo="http://schemas.microsoft.com/office/mac/office/2008/main" xmlns:mc="http://schemas.openxmlformats.org/markup-compatibility/2006" xmlns:mv="urn:schemas-microsoft-com:mac:vml" xmlns:o="urn:schemas-microsoft-com:office:office" xmlns:r="http://schemas.openxmlformats.org/officeDocument/2006/relationships" xmlns:m="http://schemas.openxmlformats.org/officeDocument/2006/math" xmlns:v="urn:schemas-microsoft-com:vml" xmlns:wp14="http://schemas.microsoft.com/office/word/2010/wordprocessingDrawing" xmlns:wp="http://schemas.openxmlformats.org/drawingml/2006/wordprocessingDrawing" xmlns:w10="urn:schemas-microsoft-com:office:word" xmlns:w="http://schemas.openxmlformats.org/wordprocessingml/2006/main" xmlns:w14="http://schemas.microsoft.com/office/word/2010/wordml" xmlns:wpg="http://schemas.microsoft.com/office/word/2010/wordprocessingGroup" xmlns:wpi="http://schemas.microsoft.com/office/word/2010/wordprocessingInk" xmlns:wne="http://schemas.microsoft.com/office/word/2006/wordml" xmlns:wps="http://schemas.microsoft.com/office/word/2010/wordprocessingShape" mc:Ignorable="w14 wp14">
   <w:body>
+    <w:p>
+      <w:pPr>
+        <w:spacing w:after="60"/>
+        <w:jc w:val="center"/>
+        <w:shd w:fill="0F766E"/>
+      </w:pPr>
+      <w:r>
+        <w:rPr>
+          <w:b/>
+          <w:color w:val="FFFFFF"/>
+          <w:sz w:val="20"/>
+        </w:rPr>
+        <w:t>PROJECT FALCON DOCUMENT-CONTROL UPDATE — 10 SEPTEMBER 2026</w:t>
+      </w:r>
+    </w:p>
+    <w:p>
+      <w:pPr>
+        <w:spacing w:after="60"/>
+        <w:jc w:val="center"/>
+        <w:shd w:fill="FEF3C7"/>
+      </w:pPr>
+      <w:r>
+        <w:rPr>
+          <w:b/>
+          <w:color w:val="B45309"/>
+          <w:sz w:val="18"/>
+        </w:rPr>
+        <w:t>STATUS OF THIS COPY: CURRENT CANONICAL THESIS — Version 4.1, generated from the Project FALCON v8.2 baseline.</w:t>
+      </w:r>
+    </w:p>
+    <w:p>
+      <w:pPr>
+        <w:spacing w:after="60"/>
+        <w:jc w:val="center"/>
+        <w:shd w:fill="F3F4F6"/>
+      </w:pPr>
+      <w:r>
+        <w:rPr>
+          <w:b w:val="0"/>
+          <w:color w:val="374151"/>
+          <w:sz w:val="16"/>
+        </w:rPr>
+        <w:t>Current pressure-sensor baseline: Holykell HPT604 Type A, provisionally 0–2 mH2O vented gauge with 4–20 mA output, is the recommended long-duration deployment candidate. The exact order code, continuous-saltwater suitability, wetted materials, seal, cable and calibration must be confirmed before purchase. The protected 12 V loop requires a 150 ohm 0.1% shunt, input protection/filtering and a 3.3 V ADS1115 receiver. Bar02 is bench-only; its old I2C PCB and wiring are not fabrication-ready. No hardware is represented as purchased or field-validated.</w:t>
+      </w:r>
+    </w:p>
     <w:p>
       <w:pPr>
         <w:jc w:val="center"/>
@@ -76,7 +121,7 @@
         <w:rPr>
           <w:i w:val="0"/>
         </w:rPr>
-        <w:t>Expanded Canonical Thesis Documentation — Version 4.0</w:t>
+        <w:t>Expanded Canonical Thesis Documentation — Version 4.1</w:t>
       </w:r>
     </w:p>
     <w:p>
@@ -347,6 +392,55 @@
               <w:rPr>
                 <w:sz w:val="17"/>
               </w:rPr>
+              <w:t>Pressure candidate</w:t>
+            </w:r>
+          </w:p>
+        </w:tc>
+        <w:tc>
+          <w:tcPr>
+            <w:tcW w:type="dxa" w:w="4677"/>
+            <w:vAlign w:val="center"/>
+            <w:tcMar>
+              <w:top w:w="100" w:type="dxa"/>
+              <w:start w:w="100" w:type="dxa"/>
+              <w:bottom w:w="100" w:type="dxa"/>
+              <w:end w:w="100" w:type="dxa"/>
+            </w:tcMar>
+            <w:shd w:fill="F4F7F9"/>
+          </w:tcPr>
+          <w:p>
+            <w:pPr>
+              <w:spacing w:after="40"/>
+            </w:pPr>
+            <w:r>
+              <w:rPr>
+                <w:sz w:val="17"/>
+              </w:rPr>
+              <w:t>Holykell HPT604 Type A, provisional 0–2 mH2O vented gauge, 4–20 mA; procurement and validation pending</w:t>
+            </w:r>
+          </w:p>
+        </w:tc>
+      </w:tr>
+      <w:tr>
+        <w:tc>
+          <w:tcPr>
+            <w:tcW w:type="dxa" w:w="4677"/>
+            <w:vAlign w:val="center"/>
+            <w:tcMar>
+              <w:top w:w="100" w:type="dxa"/>
+              <w:start w:w="100" w:type="dxa"/>
+              <w:bottom w:w="100" w:type="dxa"/>
+              <w:end w:w="100" w:type="dxa"/>
+            </w:tcMar>
+          </w:tcPr>
+          <w:p>
+            <w:pPr>
+              <w:spacing w:after="40"/>
+            </w:pPr>
+            <w:r>
+              <w:rPr>
+                <w:sz w:val="17"/>
+              </w:rPr>
               <w:t>Supporting telemetry</w:t>
             </w:r>
           </w:p>
@@ -361,7 +455,6 @@
               <w:bottom w:w="100" w:type="dxa"/>
               <w:end w:w="100" w:type="dxa"/>
             </w:tcMar>
-            <w:shd w:fill="F4F7F9"/>
           </w:tcPr>
           <w:p>
             <w:pPr>
@@ -387,6 +480,7 @@
               <w:bottom w:w="100" w:type="dxa"/>
               <w:end w:w="100" w:type="dxa"/>
             </w:tcMar>
+            <w:shd w:fill="F4F7F9"/>
           </w:tcPr>
           <w:p>
             <w:pPr>
@@ -410,6 +504,7 @@
               <w:bottom w:w="100" w:type="dxa"/>
               <w:end w:w="100" w:type="dxa"/>
             </w:tcMar>
+            <w:shd w:fill="F4F7F9"/>
           </w:tcPr>
           <w:p>
             <w:pPr>
@@ -435,7 +530,6 @@
               <w:bottom w:w="100" w:type="dxa"/>
               <w:end w:w="100" w:type="dxa"/>
             </w:tcMar>
-            <w:shd w:fill="F4F7F9"/>
           </w:tcPr>
           <w:p>
             <w:pPr>
@@ -459,7 +553,6 @@
               <w:bottom w:w="100" w:type="dxa"/>
               <w:end w:w="100" w:type="dxa"/>
             </w:tcMar>
-            <w:shd w:fill="F4F7F9"/>
           </w:tcPr>
           <w:p>
             <w:pPr>
@@ -485,6 +578,7 @@
               <w:bottom w:w="100" w:type="dxa"/>
               <w:end w:w="100" w:type="dxa"/>
             </w:tcMar>
+            <w:shd w:fill="F4F7F9"/>
           </w:tcPr>
           <w:p>
             <w:pPr>
@@ -508,6 +602,7 @@
               <w:bottom w:w="100" w:type="dxa"/>
               <w:end w:w="100" w:type="dxa"/>
             </w:tcMar>
+            <w:shd w:fill="F4F7F9"/>
           </w:tcPr>
           <w:p>
             <w:pPr>
@@ -1486,7 +1581,7 @@
         <w:rPr>
           <w:i w:val="0"/>
         </w:rPr>
-        <w:t>Phase 1 covers one controlled near-shore prototype, passive single-anchor mooring, an ESP32 buoy node, pressure-derived wave estimation, wind speed/direction, supporting GPS/power/security telemetry, LoRa transport to one shore Bay Station, local storage, one dashboard, alerts, and one short-term prediction target. The exact site, LoRa radio/gateway, final pressure sensor for continuous deployment, Bay Station computer, cellular provider, antenna, and cloud endpoint remain approval gates.</w:t>
+        <w:t>Phase 1 covers one controlled near-shore prototype, passive single-anchor mooring, an ESP32 buoy node, pressure-derived wave estimation, wind speed/direction, supporting GPS/power/security telemetry, LoRa transport to one shore Bay Station, local storage, one dashboard, alerts, and one short-term prediction target. The recommended pressure candidate is a Holykell HPT604 Type A with provisional 0–2 mH2O vented-gauge range and 4–20 mA output. Its exact order code and continuous-seawater suitability remain approval gates together with the site, LoRa radio/gateway, Bay Station computer, cellular provider, antenna, and cloud endpoint.</w:t>
       </w:r>
     </w:p>
     <w:p>
@@ -2749,7 +2844,7 @@
               <w:rPr>
                 <w:sz w:val="17"/>
               </w:rPr>
-              <w:t>Bar02 R2 for supervised prototype; continuous-deployment replacement decision pending</w:t>
+              <w:t>HPT604 Type A 0–2 mH2O, 4–20 mA deployment candidate; Bar02 bench-only</w:t>
             </w:r>
           </w:p>
         </w:tc>
@@ -2772,7 +2867,7 @@
               <w:rPr>
                 <w:sz w:val="17"/>
               </w:rPr>
-              <w:t>Depth comparison, baseline, sampling, waterproof installation, immersion/service limitation</w:t>
+              <w:t>Supplier seawater confirmation, exact order code, loop interface, depth comparison, baseline, dynamic response, vent, drift, fouling and endurance</w:t>
             </w:r>
           </w:p>
         </w:tc>
@@ -3222,7 +3317,7 @@
         <w:rPr>
           <w:i w:val="0"/>
         </w:rPr>
-        <w:t>Important pressure-sensor gate. The Bar sensor guide requires the sensing face to contact water while electronics remain dry, warns against long I²C wiring, and requires care appropriate to its gel sensing element. The final thesis must distinguish supervised short trials from unattended continuous deployment and must not represent Bar02 as a proven permanent installation before the service method or a continuously submersible alternative is approved.</w:t>
+        <w:t>Important pressure-sensor gate. The HPT604 candidate uses a protected 12 V 4–20 mA loop, a 150 ohm precision shunt, input protection/filtering, and a 3.3 V ADS1115 receiver. The theoretical loop load is 0.048–0.240 W at 12 V before conversion loss. Its vent tube must terminate in a dry breathable supplier-approved desiccant/breather arrangement. Written confirmation of continuous saltwater compatibility, exact wetted materials, seals, cable and order code is required before purchase. The current Bar02 I2C PCB/connector is incompatible and remains bench-only because the manufacturer requires daily drying and limits continuous immersion.</w:t>
       </w:r>
     </w:p>
     <w:p>
@@ -5103,7 +5198,7 @@
         <w:ind w:left="454" w:firstLine="0"/>
       </w:pPr>
       <w:r>
-        <w:t>Final continuously deployable pressure sensor and physical calibration coefficients.</w:t>
+        <w:t>Procurement, revised 4–20 mA interface, continuous-saltwater confirmation, and physical calibration coefficients for the HPT604 candidate.</w:t>
       </w:r>
     </w:p>
     <w:p>
@@ -5236,7 +5331,7 @@
               <w:rPr>
                 <w:sz w:val="17"/>
               </w:rPr>
-              <w:t>Bar02 continuous-immersion limitation</w:t>
+              <w:t>HPT604 exact seawater configuration unconfirmed</w:t>
             </w:r>
           </w:p>
         </w:tc>
@@ -5282,7 +5377,7 @@
               <w:rPr>
                 <w:sz w:val="17"/>
               </w:rPr>
-              <w:t>Restrict to supervised trials or approve a continuously submersible replacement.</w:t>
+              <w:t>Obtain written supplier confirmation; validate vent, materials, cable, drift, fouling and staged endurance before unattended use.</w:t>
             </w:r>
           </w:p>
         </w:tc>
@@ -5308,7 +5403,7 @@
               <w:rPr>
                 <w:sz w:val="17"/>
               </w:rPr>
-              <w:t>Undefined LoRa path</w:t>
+              <w:t>Existing PCB targets Bar02 I2C</w:t>
             </w:r>
           </w:p>
         </w:tc>
@@ -5356,7 +5451,7 @@
               <w:rPr>
                 <w:sz w:val="17"/>
               </w:rPr>
-              <w:t>Freeze legal band/hardware and complete a site coverage survey before PCB/deployment release.</w:t>
+              <w:t>Do not fabricate; redesign and bench-test the protected 4–20 mA receiver and keyed connector.</w:t>
             </w:r>
           </w:p>
         </w:tc>
@@ -5381,7 +5476,7 @@
               <w:rPr>
                 <w:sz w:val="17"/>
               </w:rPr>
-              <w:t>Insufficient calibrated AI data</w:t>
+              <w:t>Undefined LoRa path</w:t>
             </w:r>
           </w:p>
         </w:tc>
@@ -5427,7 +5522,7 @@
               <w:rPr>
                 <w:sz w:val="17"/>
               </w:rPr>
-              <w:t>Use transparent baseline; collect data; avoid accuracy claims until held-out evaluation.</w:t>
+              <w:t>Freeze legal band/hardware and complete a site coverage survey before PCB/deployment release.</w:t>
             </w:r>
           </w:p>
         </w:tc>
@@ -5453,7 +5548,7 @@
               <w:rPr>
                 <w:sz w:val="17"/>
               </w:rPr>
-              <w:t>Power assumptions differ from measured load</w:t>
+              <w:t>Insufficient calibrated AI data</w:t>
             </w:r>
           </w:p>
         </w:tc>
@@ -5501,7 +5596,7 @@
               <w:rPr>
                 <w:sz w:val="17"/>
               </w:rPr>
-              <w:t>Log all operating modes and redesign capacity from measured Wh/day.</w:t>
+              <w:t>Use transparent baseline; collect data; avoid accuracy claims until held-out evaluation.</w:t>
             </w:r>
           </w:p>
         </w:tc>
@@ -5526,7 +5621,7 @@
               <w:rPr>
                 <w:sz w:val="17"/>
               </w:rPr>
-              <w:t>Water ingress/corrosion</w:t>
+              <w:t>Power assumptions differ from measured load</w:t>
             </w:r>
           </w:p>
         </w:tc>
@@ -5572,7 +5667,7 @@
               <w:rPr>
                 <w:sz w:val="17"/>
               </w:rPr>
-              <w:t>Ingress and salt-exposure tests, inspection schedule, strain relief, and serviceable seals.</w:t>
+              <w:t>Log all operating modes and redesign capacity from measured Wh/day.</w:t>
             </w:r>
           </w:p>
         </w:tc>
@@ -5598,7 +5693,152 @@
               <w:rPr>
                 <w:sz w:val="17"/>
               </w:rPr>
+              <w:t>Water ingress/corrosion</w:t>
+            </w:r>
+          </w:p>
+        </w:tc>
+        <w:tc>
+          <w:tcPr>
+            <w:tcW w:type="dxa" w:w="3118"/>
+            <w:vAlign w:val="center"/>
+            <w:tcMar>
+              <w:top w:w="100" w:type="dxa"/>
+              <w:start w:w="100" w:type="dxa"/>
+              <w:bottom w:w="100" w:type="dxa"/>
+              <w:end w:w="100" w:type="dxa"/>
+            </w:tcMar>
+            <w:shd w:fill="F4F7F9"/>
+          </w:tcPr>
+          <w:p>
+            <w:pPr>
+              <w:spacing w:after="40"/>
+            </w:pPr>
+            <w:r>
+              <w:rPr>
+                <w:sz w:val="17"/>
+              </w:rPr>
+              <w:t>High</w:t>
+            </w:r>
+          </w:p>
+        </w:tc>
+        <w:tc>
+          <w:tcPr>
+            <w:tcW w:type="dxa" w:w="3118"/>
+            <w:vAlign w:val="center"/>
+            <w:tcMar>
+              <w:top w:w="100" w:type="dxa"/>
+              <w:start w:w="100" w:type="dxa"/>
+              <w:bottom w:w="100" w:type="dxa"/>
+              <w:end w:w="100" w:type="dxa"/>
+            </w:tcMar>
+            <w:shd w:fill="F4F7F9"/>
+          </w:tcPr>
+          <w:p>
+            <w:pPr>
+              <w:spacing w:after="40"/>
+            </w:pPr>
+            <w:r>
+              <w:rPr>
+                <w:sz w:val="17"/>
+              </w:rPr>
+              <w:t>Ingress and salt-exposure tests, inspection schedule, strain relief, and serviceable seals.</w:t>
+            </w:r>
+          </w:p>
+        </w:tc>
+      </w:tr>
+      <w:tr>
+        <w:tc>
+          <w:tcPr>
+            <w:tcW w:type="dxa" w:w="3118"/>
+            <w:vAlign w:val="center"/>
+            <w:tcMar>
+              <w:top w:w="100" w:type="dxa"/>
+              <w:start w:w="100" w:type="dxa"/>
+              <w:bottom w:w="100" w:type="dxa"/>
+              <w:end w:w="100" w:type="dxa"/>
+            </w:tcMar>
+          </w:tcPr>
+          <w:p>
+            <w:pPr>
+              <w:spacing w:after="40"/>
+            </w:pPr>
+            <w:r>
+              <w:rPr>
+                <w:sz w:val="17"/>
+              </w:rPr>
               <w:t>GPS false security alerts</w:t>
+            </w:r>
+          </w:p>
+        </w:tc>
+        <w:tc>
+          <w:tcPr>
+            <w:tcW w:type="dxa" w:w="3118"/>
+            <w:vAlign w:val="center"/>
+            <w:tcMar>
+              <w:top w:w="100" w:type="dxa"/>
+              <w:start w:w="100" w:type="dxa"/>
+              <w:bottom w:w="100" w:type="dxa"/>
+              <w:end w:w="100" w:type="dxa"/>
+            </w:tcMar>
+          </w:tcPr>
+          <w:p>
+            <w:pPr>
+              <w:spacing w:after="40"/>
+            </w:pPr>
+            <w:r>
+              <w:rPr>
+                <w:sz w:val="17"/>
+              </w:rPr>
+              <w:t>Medium</w:t>
+            </w:r>
+          </w:p>
+        </w:tc>
+        <w:tc>
+          <w:tcPr>
+            <w:tcW w:type="dxa" w:w="3118"/>
+            <w:vAlign w:val="center"/>
+            <w:tcMar>
+              <w:top w:w="100" w:type="dxa"/>
+              <w:start w:w="100" w:type="dxa"/>
+              <w:bottom w:w="100" w:type="dxa"/>
+              <w:end w:w="100" w:type="dxa"/>
+            </w:tcMar>
+          </w:tcPr>
+          <w:p>
+            <w:pPr>
+              <w:spacing w:after="40"/>
+            </w:pPr>
+            <w:r>
+              <w:rPr>
+                <w:sz w:val="17"/>
+              </w:rPr>
+              <w:t>Measure scatter and use fix quality, persistence, and maintenance states.</w:t>
+            </w:r>
+          </w:p>
+        </w:tc>
+      </w:tr>
+      <w:tr>
+        <w:tc>
+          <w:tcPr>
+            <w:tcW w:type="dxa" w:w="3118"/>
+            <w:vAlign w:val="center"/>
+            <w:tcMar>
+              <w:top w:w="100" w:type="dxa"/>
+              <w:start w:w="100" w:type="dxa"/>
+              <w:bottom w:w="100" w:type="dxa"/>
+              <w:end w:w="100" w:type="dxa"/>
+            </w:tcMar>
+            <w:shd w:fill="F4F7F9"/>
+          </w:tcPr>
+          <w:p>
+            <w:pPr>
+              <w:spacing w:after="40"/>
+            </w:pPr>
+            <w:r>
+              <w:rPr>
+                <w:sz w:val="17"/>
+              </w:rPr>
+              <w:t>Operator confusion</w:t>
             </w:r>
           </w:p>
         </w:tc>
@@ -5637,77 +5877,6 @@
               <w:end w:w="100" w:type="dxa"/>
             </w:tcMar>
             <w:shd w:fill="F4F7F9"/>
-          </w:tcPr>
-          <w:p>
-            <w:pPr>
-              <w:spacing w:after="40"/>
-            </w:pPr>
-            <w:r>
-              <w:rPr>
-                <w:sz w:val="17"/>
-              </w:rPr>
-              <w:t>Measure scatter and use fix quality, persistence, and maintenance states.</w:t>
-            </w:r>
-          </w:p>
-        </w:tc>
-      </w:tr>
-      <w:tr>
-        <w:tc>
-          <w:tcPr>
-            <w:tcW w:type="dxa" w:w="3118"/>
-            <w:vAlign w:val="center"/>
-            <w:tcMar>
-              <w:top w:w="100" w:type="dxa"/>
-              <w:start w:w="100" w:type="dxa"/>
-              <w:bottom w:w="100" w:type="dxa"/>
-              <w:end w:w="100" w:type="dxa"/>
-            </w:tcMar>
-          </w:tcPr>
-          <w:p>
-            <w:pPr>
-              <w:spacing w:after="40"/>
-            </w:pPr>
-            <w:r>
-              <w:rPr>
-                <w:sz w:val="17"/>
-              </w:rPr>
-              <w:t>Operator confusion</w:t>
-            </w:r>
-          </w:p>
-        </w:tc>
-        <w:tc>
-          <w:tcPr>
-            <w:tcW w:type="dxa" w:w="3118"/>
-            <w:vAlign w:val="center"/>
-            <w:tcMar>
-              <w:top w:w="100" w:type="dxa"/>
-              <w:start w:w="100" w:type="dxa"/>
-              <w:bottom w:w="100" w:type="dxa"/>
-              <w:end w:w="100" w:type="dxa"/>
-            </w:tcMar>
-          </w:tcPr>
-          <w:p>
-            <w:pPr>
-              <w:spacing w:after="40"/>
-            </w:pPr>
-            <w:r>
-              <w:rPr>
-                <w:sz w:val="17"/>
-              </w:rPr>
-              <w:t>Medium</w:t>
-            </w:r>
-          </w:p>
-        </w:tc>
-        <w:tc>
-          <w:tcPr>
-            <w:tcW w:type="dxa" w:w="3118"/>
-            <w:vAlign w:val="center"/>
-            <w:tcMar>
-              <w:top w:w="100" w:type="dxa"/>
-              <w:start w:w="100" w:type="dxa"/>
-              <w:bottom w:w="100" w:type="dxa"/>
-              <w:end w:w="100" w:type="dxa"/>
-            </w:tcMar>
           </w:tcPr>
           <w:p>
             <w:pPr>
@@ -6332,6 +6501,15 @@
         <w:jc w:val="left"/>
       </w:pPr>
       <w:r>
+        <w:t>Holykell. (n.d.). HPT604 Type A level sensor datasheet. https://www.holykell.com/wp-content/uploads/2023/08/HPT604A-Level-sensor-Datasheet-Holykell-V26-CS-1.pdf</w:t>
+      </w:r>
+    </w:p>
+    <w:p>
+      <w:pPr>
+        <w:ind w:left="454" w:hanging="454"/>
+        <w:jc w:val="left"/>
+      </w:pPr>
+      <w:r>
         <w:t>Blue Robotics. (n.d.). Bar high-resolution depth/pressure sensors guide. https://bluerobotics.com/learn/bar-sensors-guide/</w:t>
       </w:r>
     </w:p>
@@ -6847,7 +7025,7 @@
         <w:ind w:left="454" w:firstLine="0"/>
       </w:pPr>
       <w:r>
-        <w:t>Continuously deployable pressure-sensor decision</w:t>
+        <w:t>Exact HPT604 order code, continuous-seawater confirmation, revised loop interface, and pressure-sensor validation</w:t>
       </w:r>
     </w:p>
     <w:p>

</xml_diff>

<commit_message>
Update thesis chapters for cloud buoy revision
</commit_message>
<xml_diff>
--- a/THESIS DOCUMENTATION/BayStation.docx
+++ b/THESIS DOCUMENTATION/BayStation.docx
@@ -2,6 +2,14 @@
 <file path=word/document.xml><?xml version="1.0" encoding="utf-8"?>
 <w:document xmlns:o="urn:schemas-microsoft-com:office:office" xmlns:r="http://schemas.openxmlformats.org/officeDocument/2006/relationships" xmlns:v="urn:schemas-microsoft-com:vml" xmlns:w="http://schemas.openxmlformats.org/wordprocessingml/2006/main" xmlns:w10="urn:schemas-microsoft-com:office:word" xmlns:wp="http://schemas.openxmlformats.org/drawingml/2006/wordprocessingDrawing" xmlns:wps="http://schemas.microsoft.com/office/word/2010/wordprocessingShape" xmlns:wpg="http://schemas.microsoft.com/office/word/2010/wordprocessingGroup" xmlns:mc="http://schemas.openxmlformats.org/markup-compatibility/2006" xmlns:wp14="http://schemas.microsoft.com/office/word/2010/wordprocessingDrawing" xmlns:w14="http://schemas.microsoft.com/office/word/2010/wordml" xmlns:w15="http://schemas.microsoft.com/office/word/2012/wordml" mc:Ignorable="w14 wp14 w15">
   <w:body>
+    <w:p>
+      <w:pPr/>
+      <w:r>
+        <w:t>PROJECT FALCON DOCUMENT-CONTROL UPDATE — 9 OCTOBER 2026</w:t>
+        <w:br/>
+        <w:t>STATUS OF THIS COPY: REVISED THESIS BASELINE — compact can-buoy, event-driven Wi-Fi/LTE cloud telemetry, reduced battery, and physical validation pending.</w:t>
+      </w:r>
+    </w:p>
     <w:p>
       <w:pPr>
         <w:pStyle w:val="Normal"/>
@@ -149,7 +157,7 @@
           <w:color w:val="000000"/>
           <w:sz w:val="30"/>
         </w:rPr>
-        <w:t>Design and Development of a Solar-Powered Smart Coastal Observation Buoy with a Shore-Based Bay Station for Pressure-Derived Wave Monitoring and AI-Assisted Short-Term Prediction</w:t>
+        <w:t>Design and Development of a Solar-Powered Smart Coastal Observation Buoy with Event-Driven Cloud Telemetry for Pressure-Derived Wave Monitoring and AI-Assisted Short-Term Prediction</w:t>
       </w:r>
     </w:p>
     <w:p>
@@ -481,7 +489,7 @@
                 <w:szCs w:val="22"/>
                 <w:lang w:val="en-US" w:eastAsia="en-US" w:bidi="ar-SA"/>
               </w:rPr>
-              <w:t>ESP32 buoy → LoRa → shore Bay Station → SIM/4G/5G Internet backhaul</w:t>
+              <w:t>ESP32 buoy -&gt; Wi-Fi or LTE -&gt; cloud/edge API, database, and dashboard</w:t>
             </w:r>
           </w:p>
         </w:tc>
@@ -801,7 +809,7 @@
                 <w:szCs w:val="22"/>
                 <w:lang w:val="en-US" w:eastAsia="en-US" w:bidi="ar-SA"/>
               </w:rPr>
-              <w:t>Required shore-based prediction feature; current model is an unvalidated research baseline</w:t>
+              <w:t>Required cloud/edge prediction feature; current model is an unvalidated research baseline</w:t>
             </w:r>
           </w:p>
         </w:tc>
@@ -988,7 +996,7 @@
         <w:rPr>
           <w:i w:val="false"/>
         </w:rPr>
-        <w:t>Project FALCON-01 proposes an affordable, modular, solar-powered coastal observation buoy for controlled near-shore monitoring. The buoy uses an ESP32 to acquire underwater pressure and wind measurements and to attach supporting GPS, power, security, and health telemetry. Compact packets are transmitted through a site-tested LoRa link to a shore-based Bay Station located at a barangay facility. The Bay Station stores original and derived records in SQLite, estimates wave height from calibrated pressure variation, runs a short-term AI-assisted prediction pipeline, serves a readable four-page dashboard, and uses SIM/4G/5G only as its Internet backhaul. The study evaluates the prototype through sensor-reference comparison, communication reliability, power autonomy, usability, security false-alert behavior, mechanical readiness, and chronological AI validation. The system is an educational research and decision-support prototype; it does not replace PAGASA products, certified oceanographic instruments, navigation systems, or emergency warnings.</w:t>
+        <w:t>Project FALCON-01 proposes an affordable, modular, solar-powered coastal observation buoy for controlled near-shore monitoring. The buoy uses an ESP32 to acquire underwater pressure and wind measurements and to attach supporting GPS, power, security, and health telemetry. Compact event packets and scheduled summaries are sent through Wi-Fi during laboratory or near-shore testing, or through a 4G/LTE modem during a remote coastal trial, to an approved cloud/edge service. The service stores original and derived records in SQLite, estimates wave height from calibrated pressure variation, runs a short-term AI-assisted prediction pipeline, and serves a readable four-page dashboard. The study evaluates the prototype through sensor-reference comparison, communication reliability, power autonomy, usability, security false-alert behavior, mechanical readiness, and chronological AI validation. The system is an educational research and decision-support prototype; it does not replace PAGASA products, certified oceanographic instruments, navigation systems, or emergency warnings.</w:t>
       </w:r>
     </w:p>
     <w:p>
@@ -1001,7 +1009,7 @@
         <w:rPr>
           <w:i/>
         </w:rPr>
-        <w:t>Keywords: coastal observation buoy, ESP32, LoRa, Bay Station, underwater pressure, estimated wave height, wind monitoring, edge computing, short-term prediction</w:t>
+        <w:t>Keywords: coastal observation buoy, ESP32, Wi-Fi/LTE, cloud/edge service, underwater pressure, estimated wave height, wind monitoring, edge computing, short-term prediction</w:t>
       </w:r>
     </w:p>
     <w:p>
@@ -1748,7 +1756,7 @@
       </w:pPr>
       <w:r>
         <w:rPr/>
-        <w:t>Figure 5. Buoy and shore Bay Station power boundaries</w:t>
+        <w:t>Figure 5. Buoy and cloud/edge power boundaries</w:t>
       </w:r>
     </w:p>
     <w:p>
@@ -1825,7 +1833,7 @@
         <w:rPr>
           <w:i w:val="false"/>
         </w:rPr>
-        <w:t>Affordable controllers, low-power radios, renewable-energy components, and open-source software allow researchers to investigate a locally maintainable observation platform. Project FALCON combines a solar buoy sensing node with a shore Bay Station. Its purpose is to collect traceable measurements, preserve data during connectivity interruptions, and present current conditions in language that non-technical operators can understand.</w:t>
+        <w:t>Affordable controllers, low-power radios, renewable-energy components, and open-source software allow researchers to investigate a locally maintainable observation platform. Project FALCON combines a solar buoy sensing node with event-driven cloud telemetry. Its purpose is to collect traceable measurements, preserve data during connectivity interruptions, and present current conditions in language that non-technical operators can understand.</w:t>
       </w:r>
     </w:p>
     <w:p>
@@ -1879,7 +1887,7 @@
       </w:pPr>
       <w:r>
         <w:rPr/>
-        <w:t>How reliably can the ESP32–LoRa–Bay Station path deliver timestamped records and recover from link or Internet outages without silent data loss or duplication?</w:t>
+        <w:t>How reliably can the ESP32 Wi-Fi/LTE cloud path deliver timestamped records and recover from link or Internet outages without silent data loss or duplication?</w:t>
       </w:r>
     </w:p>
     <w:p>
@@ -1963,7 +1971,7 @@
         <w:rPr>
           <w:i w:val="false"/>
         </w:rPr>
-        <w:t>To design, develop, and evaluate an affordable solar-powered coastal observation buoy and shore-based Bay Station that provide pressure-derived wave monitoring, wind observations, resilient telemetry, operator-friendly visualization, and AI-assisted short-term wave-height prediction.</w:t>
+        <w:t>To design, develop, and evaluate an affordable solar-powered coastal observation buoy and cloud/edge service that provide pressure-derived wave monitoring, wind observations, resilient telemetry, operator-friendly visualization, and AI-assisted short-term wave-height prediction.</w:t>
       </w:r>
     </w:p>
     <w:p>
@@ -2003,7 +2011,7 @@
       </w:pPr>
       <w:r>
         <w:rPr/>
-        <w:t>Implement timestamping, validation, calibration metadata, LoRa transmission, and outage buffering.</w:t>
+        <w:t>Implement timestamping, validation, calibration metadata, event-driven Wi-Fi/LTE upload, and outage buffering.</w:t>
       </w:r>
     </w:p>
     <w:p>
@@ -2033,7 +2041,7 @@
       </w:pPr>
       <w:r>
         <w:rPr/>
-        <w:t>Implement Bay Station ingestion, SQLite storage, duplicate prevention, alerts, API services, and four-page dashboard hosting.</w:t>
+        <w:t>Implement cloud/edge ingestion, SQLite storage, duplicate prevention, alerts, API services, and four-page dashboard hosting.</w:t>
       </w:r>
     </w:p>
     <w:p>
@@ -2510,7 +2518,7 @@
         <w:rPr>
           <w:i w:val="false"/>
         </w:rPr>
-        <w:t>Phase 1 covers one controlled near-shore prototype, passive single-anchor mooring, an ESP32 buoy node, pressure-derived wave estimation, wind speed/direction, supporting GPS/power/security telemetry, LoRa transport to one shore Bay Station, local storage, one dashboard, alerts, and one short-term prediction target. The recommended pressure candidate is a Holykell HPT604 Type A with provisional 0–2 mH2O vented-gauge range and 4–20 mA output. Its exact order code and continuous-seawater suitability remain approval gates together with the site, LoRa radio/gateway, Bay Station computer, cellular provider, antenna, and cloud endpoint.</w:t>
+        <w:t>Phase 1 covers one controlled near-shore prototype, passive single-anchor mooring, an ESP32 buoy node, pressure-derived wave estimation, wind speed/direction, supporting GPS/power/security telemetry, Wi-Fi/LTE cloud transport to one cloud/edge service, local storage, one dashboard, alerts, and one short-term prediction target. The recommended pressure candidate is a Holykell HPT604 Type A with provisional 0–2 mH2O vented-gauge range and 4–20 mA output. Its exact order code and continuous-seawater suitability remain approval gates together with the site, Wi-Fi access point or LTE modem, antenna, SIM/data plan, authentication method, buffering behavior, and cloud endpoint.</w:t>
       </w:r>
     </w:p>
     <w:p>
@@ -2985,7 +2993,7 @@
                 <w:szCs w:val="22"/>
                 <w:lang w:val="en-US" w:eastAsia="en-US" w:bidi="ar-SA"/>
               </w:rPr>
-              <w:t>Bay Station</w:t>
+              <w:t>cloud/edge service</w:t>
             </w:r>
           </w:p>
         </w:tc>
@@ -3023,7 +3031,7 @@
                 <w:szCs w:val="22"/>
                 <w:lang w:val="en-US" w:eastAsia="en-US" w:bidi="ar-SA"/>
               </w:rPr>
-              <w:t>The shore computer and gateway that store, process, predict, alert, and serve the dashboard.</w:t>
+              <w:t>The approved cloud/edge service that stores, processes, predicts, alerts, and serves the dashboard.</w:t>
             </w:r>
           </w:p>
         </w:tc>
@@ -3065,7 +3073,7 @@
                 <w:szCs w:val="22"/>
                 <w:lang w:val="en-US" w:eastAsia="en-US" w:bidi="ar-SA"/>
               </w:rPr>
-              <w:t>LoRa</w:t>
+              <w:t>Wi-Fi/LTE</w:t>
             </w:r>
           </w:p>
         </w:tc>
@@ -3104,7 +3112,7 @@
                 <w:szCs w:val="22"/>
                 <w:lang w:val="en-US" w:eastAsia="en-US" w:bidi="ar-SA"/>
               </w:rPr>
-              <w:t>The primary buoy-to-shore radio link; it is not the buoy's direct Internet connection.</w:t>
+              <w:t>The event-driven cloud telemetry link used by the buoy; Wi-Fi is for laboratory or near-shore tests and LTE is for remote field trials.</w:t>
             </w:r>
           </w:p>
         </w:tc>
@@ -3346,7 +3354,7 @@
         <w:rPr>
           <w:i w:val="false"/>
         </w:rPr>
-        <w:t>Dreyer et al. (2026) provides emerging evidence that LoRa can support coastal buoy telemetry, but the work is a preprint and cannot substitute for a site survey. Cho et al. (2021) demonstrates why marine sensing, communication, and battery behavior must be evaluated together. Skålvik et al. (2023) identifies calibration drift, corrosion, power limits, intermittent communication, and limited references as recurring threats to ocean-sensor data quality. These findings support FALCON's buffering, quality flags, measured energy budget, and controlled maintenance plan.</w:t>
+        <w:t>Dreyer et al. (2026) provides emerging evidence for low-power coastal buoy telemetry, but it is a preprint and cannot substitute for a site survey. The revised FALCON path uses Wi-Fi for laboratory or near-shore testing and LTE for remote cloud upload, so coverage, data cost, power peaks, and recovery behavior must be measured directly. Cho et al. (2021) demonstrates why marine sensing, communication, and battery behavior must be evaluated together. Skålvik et al. (2023) identifies calibration drift, corrosion, power limits, intermittent communication, and limited references as recurring threats to ocean-sensor data quality. These findings support FALCON's buffering, quality flags, measured energy budget, and controlled maintenance plan.</w:t>
       </w:r>
     </w:p>
     <w:p>
@@ -3418,7 +3426,7 @@
         <w:rPr>
           <w:i w:val="false"/>
         </w:rPr>
-        <w:t>Prior studies establish the feasibility of low-cost buoys, pressure-based wave reconstruction, renewable power, wireless telemetry, and data-driven prediction separately. The defensible gap is the lack of a reproducible student-scale system evaluated as a whole for a defined local Philippine near-shore use case using pressure-derived wave monitoring, wind observations, a resilient LoRa-to-Bay-Station data path, transparent prediction, and an interface intended for non-technical operators. FALCON claims novelty in locally adapted integration and evidence-based evaluation—not invention of the sensors, LoRa, or AI algorithms.</w:t>
+        <w:t>Prior studies establish the feasibility of low-cost buoys, pressure-based wave reconstruction, renewable power, wireless telemetry, and data-driven prediction separately. The defensible gap is the lack of a reproducible student-scale system evaluated as a whole for a defined local Philippine near-shore use case using pressure-derived wave monitoring, wind observations, a resilient Wi-Fi/LTE cloud data path, transparent prediction, and an interface intended for non-technical operators. FALCON claims novelty in locally adapted integration and evidence-based evaluation—not invention of the sensors, Wi-Fi/LTE, or AI algorithms.</w:t>
       </w:r>
     </w:p>
     <w:p>
@@ -3442,7 +3450,7 @@
         <w:rPr>
           <w:i w:val="false"/>
         </w:rPr>
-        <w:t>The project follows an input–process–output model. Direct pressure and wind observations enter the ESP32 acquisition layer. Communication and Bay Station services convert validated samples into retained records, derived wave statistics, predictions, and operator messages. Evaluation evidence closes the loop by determining whether each output is accurate, reliable, usable, and safe enough for the stated research scope.</w:t>
+        <w:t>The project follows an input–process–output model. Direct pressure and wind observations enter the ESP32 acquisition layer. Communication and cloud/edge services convert validated samples into retained records, event summaries, derived wave statistics, predictions, and operator messages. Evaluation evidence closes the loop by determining whether each output is accurate, reliable, usable, and safe enough for the stated research scope.</w:t>
       </w:r>
     </w:p>
     <w:p>
@@ -3927,7 +3935,7 @@
                 <w:szCs w:val="22"/>
                 <w:lang w:val="en-US" w:eastAsia="en-US" w:bidi="ar-SA"/>
               </w:rPr>
-              <w:t>Continues sensing and local security during LoRa loss.</w:t>
+              <w:t>Continues sensing and local security during Wi-Fi/LTE loss.</w:t>
             </w:r>
           </w:p>
         </w:tc>
@@ -3968,7 +3976,7 @@
                 <w:szCs w:val="22"/>
                 <w:lang w:val="en-US" w:eastAsia="en-US" w:bidi="ar-SA"/>
               </w:rPr>
-              <w:t>LoRa link</w:t>
+              <w:t>Wi-Fi/LTE cloud link</w:t>
             </w:r>
           </w:p>
         </w:tc>
@@ -4006,7 +4014,7 @@
                 <w:szCs w:val="22"/>
                 <w:lang w:val="en-US" w:eastAsia="en-US" w:bidi="ar-SA"/>
               </w:rPr>
-              <w:t>Carry compact packets to the barangay-hall gateway.</w:t>
+              <w:t>Carry compact packets to the approved cloud endpoint.</w:t>
             </w:r>
           </w:p>
         </w:tc>
@@ -4086,7 +4094,7 @@
                 <w:szCs w:val="22"/>
                 <w:lang w:val="en-US" w:eastAsia="en-US" w:bidi="ar-SA"/>
               </w:rPr>
-              <w:t>Bay Station</w:t>
+              <w:t>cloud/edge service</w:t>
             </w:r>
           </w:p>
         </w:tc>
@@ -4205,7 +4213,7 @@
                 <w:szCs w:val="22"/>
                 <w:lang w:val="en-US" w:eastAsia="en-US" w:bidi="ar-SA"/>
               </w:rPr>
-              <w:t>Internet backhaul</w:t>
+              <w:t>cloud connectivity</w:t>
             </w:r>
           </w:p>
         </w:tc>
@@ -5053,7 +5061,7 @@
                 <w:szCs w:val="22"/>
                 <w:lang w:val="en-US" w:eastAsia="en-US" w:bidi="ar-SA"/>
               </w:rPr>
-              <w:t>LoRa</w:t>
+              <w:t>Wi-Fi/LTE</w:t>
             </w:r>
           </w:p>
         </w:tc>
@@ -5092,7 +5100,7 @@
                 <w:szCs w:val="22"/>
                 <w:lang w:val="en-US" w:eastAsia="en-US" w:bidi="ar-SA"/>
               </w:rPr>
-              <w:t>Exact radio, gateway, antenna, band, and protocol TBD</w:t>
+              <w:t>Exact Wi-Fi/LTE modem, antenna, SIM/data plan, endpoint, authentication, and protocol TBD</w:t>
             </w:r>
           </w:p>
         </w:tc>
@@ -5172,7 +5180,7 @@
                 <w:szCs w:val="22"/>
                 <w:lang w:val="en-US" w:eastAsia="en-US" w:bidi="ar-SA"/>
               </w:rPr>
-              <w:t>Bay Station</w:t>
+              <w:t>cloud/edge service</w:t>
             </w:r>
           </w:p>
         </w:tc>
@@ -5210,7 +5218,7 @@
                 <w:szCs w:val="22"/>
                 <w:lang w:val="en-US" w:eastAsia="en-US" w:bidi="ar-SA"/>
               </w:rPr>
-              <w:t>Development laptop substitute; final mini PC TBD</w:t>
+              <w:t>Development laptop substitute; final host or cloud endpoint TBD</w:t>
             </w:r>
           </w:p>
         </w:tc>
@@ -5335,7 +5343,7 @@
       </w:pPr>
       <w:r>
         <w:rPr/>
-        <w:t>Buffer a defined duration of records during LoRa outages and preserve original timestamps during retransmission.</w:t>
+        <w:t>Buffer a defined duration of records during Wi-Fi/LTE outages and preserve original timestamps during retransmission.</w:t>
       </w:r>
     </w:p>
     <w:p>
@@ -5785,7 +5793,7 @@
           <w:color w:val="4B5563"/>
           <w:sz w:val="18"/>
         </w:rPr>
-        <w:t>Figure 5. Separate buoy and shore Bay Station power boundaries.</w:t>
+        <w:t>Figure 5. Separate buoy and cloud/edge power boundaries.</w:t>
       </w:r>
     </w:p>
     <w:p>
@@ -5799,7 +5807,7 @@
         <w:rPr>
           <w:i w:val="false"/>
         </w:rPr>
-        <w:t>The preliminary planning example uses a 12.8 V, 20 Ah battery (256 Wh nominal), 80% usable energy (204.8 Wh), and a 4 W average buoy load (96 Wh/day), yielding approximately 51.2 hours without charging. A 72-hour target at 4 W requires approximately 360 Wh nominal at 80% usable capacity, or 28.1 Ah at 12.8 V; a nominal 30 Ah class battery would provide only a planning margin. A 60 W panel with four peak-sun-hours and 70% net efficiency yields approximately 168 Wh/day. These figures are calculations—not measurements—and must be replaced by logged current and charging data after the exact LoRa and hardware selections are frozen.</w:t>
+        <w:t>The revised planning example starts with a 12.8 V, 6-10 Ah LiFePO4 battery and a 10-20 W solar-panel candidate because telemetry is event-driven rather than continuous. Final sizing must be based on logged ESP32, sensor, regulator, and LTE registration/transmit current, overnight deficit, charging performance, and outage buffering tests. These figures are planning assumptions, not endurance evidence.</w:t>
       </w:r>
     </w:p>
     <w:p>
@@ -5823,7 +5831,7 @@
         <w:rPr>
           <w:i w:val="false"/>
         </w:rPr>
-        <w:t>The replacement physical design must pass buoyancy, freeboard, center-of-gravity, stability/righting, tower load, mooring, corrosion, cable strain, ingress, condensation, sensor exposure, antenna clearance, retrieval, and serviceability review. Existing CAD and blueprint dimensions are references only while the geometry is under redesign. Controlled water tests must begin at an accessible supervised site with permits, deployment limits, retrieval equipment, and a time-aligned reference measurement.</w:t>
+        <w:t>The replacement compact can-buoy design must pass buoyancy, freeboard, center-of-gravity, stability/righting, top-housing and antenna load, mooring, corrosion, cable strain, ingress, condensation, sensor exposure, antenna clearance, retrieval, and serviceability review. Existing CAD and blueprint dimensions are references only while the geometry is under redesign. Controlled water tests must begin at an accessible supervised site with permits, deployment limits, retrieval equipment, and a time-aligned reference measurement.</w:t>
       </w:r>
     </w:p>
     <w:p>
@@ -6302,7 +6310,7 @@
                 <w:szCs w:val="22"/>
                 <w:lang w:val="en-US" w:eastAsia="en-US" w:bidi="ar-SA"/>
               </w:rPr>
-              <w:t>LoRa/backhaul</w:t>
+              <w:t>Wi-Fi/LTE cloud upload</w:t>
             </w:r>
           </w:p>
         </w:tc>
@@ -7309,7 +7317,7 @@
                 <w:szCs w:val="22"/>
                 <w:lang w:val="en-US" w:eastAsia="en-US" w:bidi="ar-SA"/>
               </w:rPr>
-              <w:t>LoRa link interrupted</w:t>
+              <w:t>Wi-Fi/LTE cloud link interrupted</w:t>
             </w:r>
           </w:p>
         </w:tc>
@@ -7427,7 +7435,7 @@
                 <w:szCs w:val="22"/>
                 <w:lang w:val="en-US" w:eastAsia="en-US" w:bidi="ar-SA"/>
               </w:rPr>
-              <w:t>Bay Station Internet interrupted</w:t>
+              <w:t>cloud/edge service Internet interrupted</w:t>
             </w:r>
           </w:p>
         </w:tc>
@@ -8020,7 +8028,7 @@
                 <w:szCs w:val="22"/>
                 <w:lang w:val="en-US" w:eastAsia="en-US" w:bidi="ar-SA"/>
               </w:rPr>
-              <w:t>Bay Station restart</w:t>
+              <w:t>cloud/edge service restart</w:t>
             </w:r>
           </w:p>
         </w:tc>
@@ -8149,7 +8157,7 @@
       </w:pPr>
       <w:r>
         <w:rPr/>
-        <w:t>Python Bay Station service with simulator/bench ingestion, SQLite, alerts, grouped API, static dashboard hosting, and prediction baseline.</w:t>
+        <w:t>Python cloud/edge service with simulator/bench ingestion, SQLite, alerts, grouped API, static dashboard hosting, and prediction baseline.</w:t>
       </w:r>
     </w:p>
     <w:p>
@@ -8219,7 +8227,7 @@
       </w:pPr>
       <w:r>
         <w:rPr/>
-        <w:t>Exact LoRa module, legal band, gateway, antennas, packet protocol, and site coverage.</w:t>
+        <w:t>Exact LTE modem, SIM/data plan, antenna placement, cloud endpoint, packet protocol, authentication, and site coverage.</w:t>
       </w:r>
     </w:p>
     <w:p>
@@ -8234,7 +8242,7 @@
       </w:pPr>
       <w:r>
         <w:rPr/>
-        <w:t>Final Bay Station mini PC, OS image, modem/provider, UPS, cloud endpoint, and cybersecurity controls.</w:t>
+        <w:t>Final cloud/edge host, OS image, modem/provider, UPS, cloud endpoint, and cybersecurity controls.</w:t>
       </w:r>
     </w:p>
     <w:p>
@@ -8678,7 +8686,7 @@
                 <w:szCs w:val="22"/>
                 <w:lang w:val="en-US" w:eastAsia="en-US" w:bidi="ar-SA"/>
               </w:rPr>
-              <w:t>Undefined LoRa path</w:t>
+              <w:t>Undefined Wi-Fi/LTE path</w:t>
             </w:r>
           </w:p>
         </w:tc>
@@ -9685,7 +9693,7 @@
                 <w:szCs w:val="22"/>
                 <w:lang w:val="en-US" w:eastAsia="en-US" w:bidi="ar-SA"/>
               </w:rPr>
-              <w:t>Exact BOM, datasheets, pinout, LoRa/Bay Station selection</w:t>
+              <w:t>Exact BOM, datasheets, pinout, Wi-Fi/LTE/cloud/edge service selection</w:t>
             </w:r>
           </w:p>
         </w:tc>
@@ -10226,7 +10234,7 @@
       </w:pPr>
       <w:r>
         <w:rPr/>
-        <w:t>One serviceable controlled-trial coastal buoy prototype and one shore Bay Station prototype.</w:t>
+        <w:t>One serviceable controlled-trial coastal buoy prototype and one cloud/edge service prototype.</w:t>
       </w:r>
     </w:p>
     <w:p>
@@ -10562,7 +10570,7 @@
       </w:pPr>
       <w:r>
         <w:rPr/>
-        <w:t>LoRa and Bay Station backhaul survey</w:t>
+        <w:t>Wi-Fi/LTE cloud connectivity and coverage survey</w:t>
       </w:r>
     </w:p>
     <w:p>
@@ -10938,7 +10946,7 @@
                 <w:szCs w:val="22"/>
                 <w:lang w:val="en-US" w:eastAsia="en-US" w:bidi="ar-SA"/>
               </w:rPr>
-              <w:t>LoRa is the approved primary path; exact range pending survey</w:t>
+              <w:t>Wi-Fi/LTE is the approved primary path; exact range pending survey</w:t>
             </w:r>
           </w:p>
         </w:tc>
@@ -11209,7 +11217,7 @@
       </w:pPr>
       <w:r>
         <w:rPr/>
-        <w:t>Exact LoRa hardware, legal band, coverage, security, buffering, and antenna plan</w:t>
+        <w:t>Exact Wi-Fi/LTE hardware, legal band, coverage, security, buffering, and antenna plan</w:t>
       </w:r>
     </w:p>
     <w:p>

</xml_diff>

<commit_message>
Correct FALCON core proposal scope
</commit_message>
<xml_diff>
--- a/THESIS DOCUMENTATION/BayStation.docx
+++ b/THESIS DOCUMENTATION/BayStation.docx
@@ -5,9 +5,9 @@
     <w:p>
       <w:pPr/>
       <w:r>
-        <w:t>PROJECT FALCON DOCUMENT-CONTROL UPDATE — 9 OCTOBER 2026</w:t>
+        <w:t>PROJECT FALCON DOCUMENT-CONTROL UPDATE — 10 OCTOBER 2026</w:t>
         <w:br/>
-        <w:t>STATUS OF THIS COPY: REVISED THESIS BASELINE — compact can-buoy, event-driven Wi-Fi/LTE cloud telemetry, reduced battery, and physical validation pending.</w:t>
+        <w:t>STATUS OF THIS COPY: REVISED THESIS BASELINE — compact can-buoy with water pressure, wind, GPS security/position, battery and solar power, Wi-Fi/LTE internet telemetry, reduced battery, and physical validation pending.</w:t>
       </w:r>
     </w:p>
     <w:p>
@@ -996,7 +996,7 @@
         <w:rPr>
           <w:i w:val="false"/>
         </w:rPr>
-        <w:t>Project FALCON-01 proposes an affordable, modular, solar-powered coastal observation buoy for controlled near-shore monitoring. The buoy uses an ESP32 to acquire underwater pressure and wind measurements and to attach supporting GPS, power, security, and health telemetry. Compact event packets and scheduled summaries are sent through Wi-Fi during laboratory or near-shore testing, or through a 4G/LTE modem during a remote coastal trial, to an approved cloud/edge service. The service stores original and derived records in SQLite, estimates wave height from calibrated pressure variation, runs a short-term AI-assisted prediction pipeline, and serves a readable four-page dashboard. The study evaluates the prototype through sensor-reference comparison, communication reliability, power autonomy, usability, security false-alert behavior, mechanical readiness, and chronological AI validation. The system is an educational research and decision-support prototype; it does not replace PAGASA products, certified oceanographic instruments, navigation systems, or emergency warnings.</w:t>
+        <w:t>Project FALCON-01 proposes an affordable, modular, solar-powered coastal observation buoy for controlled near-shore monitoring. The buoy uses an ESP32 to acquire underwater pressure, wind speed/direction, GPS position/security, and battery/solar power telemetry, then adds health/status data for validation. Compact event packets and scheduled summaries are sent through Wi-Fi during laboratory or near-shore testing, or through a 4G/LTE modem during a remote coastal trial, to an approved cloud/edge service. The service stores original and derived records in SQLite, estimates wave height from calibrated pressure variation, runs a short-term AI-assisted prediction pipeline, and serves a readable four-page dashboard. The study evaluates the prototype through sensor-reference comparison, communication reliability, power autonomy, usability, security false-alert behavior, mechanical readiness, and chronological AI validation. The system is an educational research and decision-support prototype; it does not replace PAGASA products, certified oceanographic instruments, navigation systems, or emergency warnings.</w:t>
       </w:r>
     </w:p>
     <w:p>
@@ -1996,7 +1996,7 @@
       </w:pPr>
       <w:r>
         <w:rPr/>
-        <w:t>Integrate pressure and wind sensors with an ESP32 and clearly identified supporting telemetry.</w:t>
+        <w:t>Integrate water pressure, wind speed/direction, GPS position/security, battery/solar monitoring, and internet communication with an ESP32 controller.</w:t>
       </w:r>
     </w:p>
     <w:p>
@@ -2518,7 +2518,7 @@
         <w:rPr>
           <w:i w:val="false"/>
         </w:rPr>
-        <w:t>Phase 1 covers one controlled near-shore prototype, passive single-anchor mooring, an ESP32 buoy node, pressure-derived wave estimation, wind speed/direction, supporting GPS/power/security telemetry, Wi-Fi/LTE cloud transport to one cloud/edge service, local storage, one dashboard, alerts, and one short-term prediction target. The recommended pressure candidate is a Holykell HPT604 Type A with provisional 0–2 mH2O vented-gauge range and 4–20 mA output. Its exact order code and continuous-seawater suitability remain approval gates together with the site, Wi-Fi access point or LTE modem, antenna, SIM/data plan, authentication method, buffering behavior, and cloud endpoint.</w:t>
+        <w:t>Phase 1 covers one controlled near-shore prototype, passive single-anchor mooring, an ESP32 buoy node, pressure-derived wave estimation, wind speed/direction, GPS position/security and battery/solar power telemetry, Wi-Fi/LTE cloud transport to one cloud/edge service, local storage, one dashboard, alerts, and one short-term prediction target. The recommended pressure candidate is a Holykell HPT604 Type A with provisional 0–2 mH2O vented-gauge range and 4–20 mA output. Its exact order code and continuous-seawater suitability remain approval gates together with the site, Wi-Fi access point or LTE modem, antenna, SIM/data plan, authentication method, buffering behavior, and cloud endpoint.</w:t>
       </w:r>
     </w:p>
     <w:p>
@@ -3450,7 +3450,7 @@
         <w:rPr>
           <w:i w:val="false"/>
         </w:rPr>
-        <w:t>The project follows an input–process–output model. Direct pressure and wind observations enter the ESP32 acquisition layer. Communication and cloud/edge services convert validated samples into retained records, event summaries, derived wave statistics, predictions, and operator messages. Evaluation evidence closes the loop by determining whether each output is accurate, reliable, usable, and safe enough for the stated research scope.</w:t>
+        <w:t>The project follows an input–process–output model. Direct water pressure, wind speed/direction, GPS position/security, and battery/solar telemetry enter the ESP32 acquisition layer. Communication and cloud/edge services convert validated samples into retained records, event summaries, derived wave statistics, predictions, and operator messages. Evaluation evidence closes the loop by determining whether each output is accurate, reliable, usable, and safe enough for the stated research scope.</w:t>
       </w:r>
     </w:p>
     <w:p>
@@ -5570,7 +5570,7 @@
         <w:rPr>
           <w:i w:val="false"/>
         </w:rPr>
-        <w:t>The approved navigation contains Overview, Buoy Motion, Sensors, and Logs &amp; Alerts. GPS is grouped under Supporting Telemetry rather than becoming a fifth page. Settings remains a compact header control. The interface uses large text, plain labels, clear source/freshness states, and minimal actions for older or non-technical users.</w:t>
+        <w:t>The approved navigation contains Overview, Buoy Motion, Sensors, and Logs &amp; Alerts. GPS position/security is grouped under Supporting Telemetry rather than becoming a fifth page. Settings remains a compact header control. The interface uses large text, plain labels, clear source/freshness states, and minimal actions for older or non-technical users.</w:t>
       </w:r>
     </w:p>
     <w:p>

</xml_diff>